<commit_message>
Add branded SAFE board consent document chrome
</commit_message>
<xml_diff>
--- a/content/templates/cooley-board-consent-safe/template.docx
+++ b/content/templates/cooley-board-consent-safe/template.docx
@@ -288,9 +288,13 @@
       </w:r>
     </w:p>
     <w:sectPr>
+      <w:headerReference w:type="first" r:id="rId7"/>
+      <w:footerReference w:type="default" r:id="rId8"/>
+      <w:footerReference w:type="first" r:id="rId9"/>
       <w:pgSz w:w="12240" w:h="15840" w:orient="portrait"/>
       <w:pgMar w:top="1440" w:right="1440" w:bottom="1440" w:left="1440" w:header="720" w:footer="720" w:gutter="0"/>
       <w:pgNumType/>
+      <w:titlePg/>
       <w:docGrid w:linePitch="360"/>
     </w:sectPr>
   </w:body>
@@ -338,6 +342,132 @@
 </w:endnotes>
 </file>
 
+<file path=word/footer1.xml><?xml version="1.0" encoding="utf-8"?>
+<w:ftr xmlns:wpc="http://schemas.microsoft.com/office/word/2010/wordprocessingCanvas" xmlns:mc="http://schemas.openxmlformats.org/markup-compatibility/2006" xmlns:o="urn:schemas-microsoft-com:office:office" xmlns:r="http://schemas.openxmlformats.org/officeDocument/2006/relationships" xmlns:m="http://schemas.openxmlformats.org/officeDocument/2006/math" xmlns:v="urn:schemas-microsoft-com:vml" xmlns:wp14="http://schemas.microsoft.com/office/word/2010/wordprocessingDrawing" xmlns:wp="http://schemas.openxmlformats.org/drawingml/2006/wordprocessingDrawing" xmlns:w10="urn:schemas-microsoft-com:office:word" xmlns:w="http://schemas.openxmlformats.org/wordprocessingml/2006/main" xmlns:w14="http://schemas.microsoft.com/office/word/2010/wordml" xmlns:w15="http://schemas.microsoft.com/office/word/2012/wordml" xmlns:wpg="http://schemas.microsoft.com/office/word/2010/wordprocessingGroup" xmlns:wpi="http://schemas.microsoft.com/office/word/2010/wordprocessingInk" xmlns:wne="http://schemas.microsoft.com/office/word/2006/wordml" xmlns:wps="http://schemas.microsoft.com/office/word/2010/wordprocessingShape">
+  <w:p>
+    <w:pPr>
+      <w:tabs>
+        <w:tab w:val="right" w:pos="9026"/>
+      </w:tabs>
+    </w:pPr>
+    <w:r>
+      <w:rPr>
+        <w:rFonts w:ascii="Times New Roman" w:cs="Times New Roman" w:eastAsia="Times New Roman" w:hAnsi="Times New Roman"/>
+        <w:color w:val="494A4B"/>
+        <w:sz w:val="20"/>
+        <w:szCs w:val="20"/>
+      </w:rPr>
+      <w:t xml:space="preserve">Board Consent for SAFE Financing (v1.0). Free to use under CC BY 4.0.</w:t>
+    </w:r>
+    <w:r>
+      <w:rPr>
+        <w:rFonts w:ascii="Times New Roman" w:cs="Times New Roman" w:eastAsia="Times New Roman" w:hAnsi="Times New Roman"/>
+        <w:color w:val="494A4B"/>
+        <w:sz w:val="20"/>
+        <w:szCs w:val="20"/>
+      </w:rPr>
+      <w:t xml:space="preserve">	Page </w:t>
+    </w:r>
+    <w:r>
+      <w:rPr>
+        <w:rFonts w:ascii="Times New Roman" w:cs="Times New Roman" w:eastAsia="Times New Roman" w:hAnsi="Times New Roman"/>
+        <w:color w:val="494A4B"/>
+        <w:sz w:val="20"/>
+        <w:szCs w:val="20"/>
+      </w:rPr>
+      <w:fldChar w:fldCharType="begin"/>
+      <w:instrText xml:space="preserve">PAGE</w:instrText>
+      <w:fldChar w:fldCharType="separate"/>
+      <w:fldChar w:fldCharType="end"/>
+    </w:r>
+    <w:r>
+      <w:rPr>
+        <w:rFonts w:ascii="Times New Roman" w:cs="Times New Roman" w:eastAsia="Times New Roman" w:hAnsi="Times New Roman"/>
+        <w:color w:val="494A4B"/>
+        <w:sz w:val="20"/>
+        <w:szCs w:val="20"/>
+      </w:rPr>
+      <w:t xml:space="preserve"> of </w:t>
+    </w:r>
+    <w:r>
+      <w:rPr>
+        <w:rFonts w:ascii="Times New Roman" w:cs="Times New Roman" w:eastAsia="Times New Roman" w:hAnsi="Times New Roman"/>
+        <w:color w:val="494A4B"/>
+        <w:sz w:val="20"/>
+        <w:szCs w:val="20"/>
+      </w:rPr>
+      <w:fldChar w:fldCharType="begin"/>
+      <w:instrText xml:space="preserve">NUMPAGES</w:instrText>
+      <w:fldChar w:fldCharType="separate"/>
+      <w:fldChar w:fldCharType="end"/>
+    </w:r>
+  </w:p>
+</w:ftr>
+</file>
+
+<file path=word/footer2.xml><?xml version="1.0" encoding="utf-8"?>
+<w:ftr xmlns:wpc="http://schemas.microsoft.com/office/word/2010/wordprocessingCanvas" xmlns:mc="http://schemas.openxmlformats.org/markup-compatibility/2006" xmlns:o="urn:schemas-microsoft-com:office:office" xmlns:r="http://schemas.openxmlformats.org/officeDocument/2006/relationships" xmlns:m="http://schemas.openxmlformats.org/officeDocument/2006/math" xmlns:v="urn:schemas-microsoft-com:vml" xmlns:wp14="http://schemas.microsoft.com/office/word/2010/wordprocessingDrawing" xmlns:wp="http://schemas.openxmlformats.org/drawingml/2006/wordprocessingDrawing" xmlns:w10="urn:schemas-microsoft-com:office:word" xmlns:w="http://schemas.openxmlformats.org/wordprocessingml/2006/main" xmlns:w14="http://schemas.microsoft.com/office/word/2010/wordml" xmlns:w15="http://schemas.microsoft.com/office/word/2012/wordml" xmlns:wpg="http://schemas.microsoft.com/office/word/2010/wordprocessingGroup" xmlns:wpi="http://schemas.microsoft.com/office/word/2010/wordprocessingInk" xmlns:wne="http://schemas.microsoft.com/office/word/2006/wordml" xmlns:wps="http://schemas.microsoft.com/office/word/2010/wordprocessingShape">
+  <w:p>
+    <w:pPr>
+      <w:tabs>
+        <w:tab w:val="right" w:pos="9026"/>
+      </w:tabs>
+    </w:pPr>
+    <w:r>
+      <w:rPr>
+        <w:rFonts w:ascii="Times New Roman" w:cs="Times New Roman" w:eastAsia="Times New Roman" w:hAnsi="Times New Roman"/>
+        <w:color w:val="494A4B"/>
+        <w:sz w:val="20"/>
+        <w:szCs w:val="20"/>
+      </w:rPr>
+      <w:t xml:space="preserve">Board Consent for SAFE Financing (v1.0). Free to use under CC BY 4.0.</w:t>
+    </w:r>
+    <w:r>
+      <w:rPr>
+        <w:rFonts w:ascii="Times New Roman" w:cs="Times New Roman" w:eastAsia="Times New Roman" w:hAnsi="Times New Roman"/>
+        <w:color w:val="494A4B"/>
+        <w:sz w:val="20"/>
+        <w:szCs w:val="20"/>
+      </w:rPr>
+      <w:t xml:space="preserve">	Page </w:t>
+    </w:r>
+    <w:r>
+      <w:rPr>
+        <w:rFonts w:ascii="Times New Roman" w:cs="Times New Roman" w:eastAsia="Times New Roman" w:hAnsi="Times New Roman"/>
+        <w:color w:val="494A4B"/>
+        <w:sz w:val="20"/>
+        <w:szCs w:val="20"/>
+      </w:rPr>
+      <w:fldChar w:fldCharType="begin"/>
+      <w:instrText xml:space="preserve">PAGE</w:instrText>
+      <w:fldChar w:fldCharType="separate"/>
+      <w:fldChar w:fldCharType="end"/>
+    </w:r>
+    <w:r>
+      <w:rPr>
+        <w:rFonts w:ascii="Times New Roman" w:cs="Times New Roman" w:eastAsia="Times New Roman" w:hAnsi="Times New Roman"/>
+        <w:color w:val="494A4B"/>
+        <w:sz w:val="20"/>
+        <w:szCs w:val="20"/>
+      </w:rPr>
+      <w:t xml:space="preserve"> of </w:t>
+    </w:r>
+    <w:r>
+      <w:rPr>
+        <w:rFonts w:ascii="Times New Roman" w:cs="Times New Roman" w:eastAsia="Times New Roman" w:hAnsi="Times New Roman"/>
+        <w:color w:val="494A4B"/>
+        <w:sz w:val="20"/>
+        <w:szCs w:val="20"/>
+      </w:rPr>
+      <w:fldChar w:fldCharType="begin"/>
+      <w:instrText xml:space="preserve">NUMPAGES</w:instrText>
+      <w:fldChar w:fldCharType="separate"/>
+      <w:fldChar w:fldCharType="end"/>
+    </w:r>
+  </w:p>
+</w:ftr>
+</file>
+
 <file path=word/footnotes.xml><?xml version="1.0" encoding="utf-8"?>
 <w:footnotes xmlns:wpc="http://schemas.microsoft.com/office/word/2010/wordprocessingCanvas" xmlns:mc="http://schemas.openxmlformats.org/markup-compatibility/2006" xmlns:o="urn:schemas-microsoft-com:office:office" xmlns:r="http://schemas.openxmlformats.org/officeDocument/2006/relationships" xmlns:m="http://schemas.openxmlformats.org/officeDocument/2006/math" xmlns:v="urn:schemas-microsoft-com:vml" xmlns:wp14="http://schemas.microsoft.com/office/word/2010/wordprocessingDrawing" xmlns:wp="http://schemas.openxmlformats.org/drawingml/2006/wordprocessingDrawing" xmlns:w10="urn:schemas-microsoft-com:office:word" xmlns:w="http://schemas.openxmlformats.org/wordprocessingml/2006/main" xmlns:w14="http://schemas.microsoft.com/office/word/2010/wordml" xmlns:w15="http://schemas.microsoft.com/office/word/2012/wordml" xmlns:wpg="http://schemas.microsoft.com/office/word/2010/wordprocessingGroup" xmlns:wpi="http://schemas.microsoft.com/office/word/2010/wordprocessingInk" xmlns:wne="http://schemas.microsoft.com/office/word/2006/wordml" xmlns:wps="http://schemas.microsoft.com/office/word/2010/wordprocessingShape" mc:Ignorable="w14 w15 wp14">
   <w:footnote w:type="separator" w:id="-1">
@@ -373,6 +503,97 @@
     </w:p>
   </w:footnote>
 </w:footnotes>
+</file>
+
+<file path=word/header1.xml><?xml version="1.0" encoding="utf-8"?>
+<w:hdr xmlns:wpc="http://schemas.microsoft.com/office/word/2010/wordprocessingCanvas" xmlns:mc="http://schemas.openxmlformats.org/markup-compatibility/2006" xmlns:o="urn:schemas-microsoft-com:office:office" xmlns:r="http://schemas.openxmlformats.org/officeDocument/2006/relationships" xmlns:m="http://schemas.openxmlformats.org/officeDocument/2006/math" xmlns:v="urn:schemas-microsoft-com:vml" xmlns:wp14="http://schemas.microsoft.com/office/word/2010/wordprocessingDrawing" xmlns:wp="http://schemas.openxmlformats.org/drawingml/2006/wordprocessingDrawing" xmlns:w10="urn:schemas-microsoft-com:office:word" xmlns:w="http://schemas.openxmlformats.org/wordprocessingml/2006/main" xmlns:w14="http://schemas.microsoft.com/office/word/2010/wordml" xmlns:w15="http://schemas.microsoft.com/office/word/2012/wordml" xmlns:wpg="http://schemas.microsoft.com/office/word/2010/wordprocessingGroup" xmlns:wpi="http://schemas.microsoft.com/office/word/2010/wordprocessingInk" xmlns:wne="http://schemas.microsoft.com/office/word/2006/wordml" xmlns:wps="http://schemas.microsoft.com/office/word/2010/wordprocessingShape" xmlns:cx="http://schemas.microsoft.com/office/drawing/2014/chartex" xmlns:cx1="http://schemas.microsoft.com/office/drawing/2015/9/8/chartex" xmlns:cx2="http://schemas.microsoft.com/office/drawing/2015/10/21/chartex" xmlns:cx3="http://schemas.microsoft.com/office/drawing/2016/5/9/chartex" xmlns:cx4="http://schemas.microsoft.com/office/drawing/2016/5/10/chartex" xmlns:cx5="http://schemas.microsoft.com/office/drawing/2016/5/11/chartex" xmlns:cx6="http://schemas.microsoft.com/office/drawing/2016/5/12/chartex" xmlns:cx7="http://schemas.microsoft.com/office/drawing/2016/5/13/chartex" xmlns:cx8="http://schemas.microsoft.com/office/drawing/2016/5/14/chartex" xmlns:w16cid="http://schemas.microsoft.com/office/word/2016/wordml/cid" xmlns:w16se="http://schemas.microsoft.com/office/word/2015/wordml/symex">
+  <w:tbl>
+    <w:tblPr>
+      <w:tblW w:type="dxa" w:w="9360"/>
+      <w:tblBorders>
+        <w:top w:val="single" w:color="107087" w:sz="14"/>
+        <w:left w:val="nil" w:color="FFFFFF" w:sz="0"/>
+        <w:bottom w:val="nil" w:color="FFFFFF" w:sz="0"/>
+        <w:right w:val="nil" w:color="FFFFFF" w:sz="0"/>
+        <w:insideH w:val="single" w:color="auto" w:sz="4"/>
+        <w:insideV w:val="single" w:color="auto" w:sz="4"/>
+      </w:tblBorders>
+      <w:tblLayout w:type="fixed"/>
+    </w:tblPr>
+    <w:tblGrid>
+      <w:gridCol w:w="6178"/>
+      <w:gridCol w:w="3182"/>
+    </w:tblGrid>
+    <w:tr>
+      <w:trPr>
+        <w:trHeight w:val="360" w:hRule="atLeast"/>
+      </w:trPr>
+      <w:tc>
+        <w:tcPr>
+          <w:tcBorders>
+            <w:top w:val="nil" w:color="FFFFFF" w:sz="0"/>
+            <w:left w:val="nil" w:color="FFFFFF" w:sz="0"/>
+            <w:bottom w:val="nil" w:color="FFFFFF" w:sz="0"/>
+            <w:right w:val="nil" w:color="FFFFFF" w:sz="0"/>
+          </w:tcBorders>
+          <w:tcMar>
+            <w:top w:type="dxa" w:w="36"/>
+            <w:left w:type="dxa" w:w="0"/>
+            <w:bottom w:type="dxa" w:w="0"/>
+            <w:right w:type="dxa" w:w="0"/>
+          </w:tcMar>
+        </w:tcPr>
+        <w:p>
+          <w:r>
+            <w:t xml:space="preserve"/>
+          </w:r>
+        </w:p>
+      </w:tc>
+      <w:tc>
+        <w:tcPr>
+          <w:tcBorders>
+            <w:top w:val="nil" w:color="FFFFFF" w:sz="0"/>
+            <w:left w:val="nil" w:color="FFFFFF" w:sz="0"/>
+            <w:bottom w:val="nil" w:color="FFFFFF" w:sz="0"/>
+            <w:right w:val="nil" w:color="FFFFFF" w:sz="0"/>
+          </w:tcBorders>
+          <w:tcMar>
+            <w:top w:type="dxa" w:w="36"/>
+            <w:left w:type="dxa" w:w="0"/>
+            <w:bottom w:type="dxa" w:w="0"/>
+            <w:right w:type="dxa" w:w="0"/>
+          </w:tcMar>
+          <w:vAlign w:val="center"/>
+        </w:tcPr>
+        <w:p>
+          <w:pPr>
+            <w:spacing w:after="0" w:before="0"/>
+            <w:jc w:val="right"/>
+          </w:pPr>
+          <w:r>
+            <w:rPr>
+              <w:rFonts w:ascii="Times New Roman" w:cs="Times New Roman" w:eastAsia="Times New Roman" w:hAnsi="Times New Roman"/>
+              <w:b/>
+              <w:bCs/>
+              <w:color w:val="107087"/>
+              <w:sz w:val="18"/>
+              <w:szCs w:val="18"/>
+            </w:rPr>
+            <w:t xml:space="preserve">BOARD CONSENT FOR APPROVING SAFE (DELAWARE)</w:t>
+          </w:r>
+        </w:p>
+      </w:tc>
+    </w:tr>
+  </w:tbl>
+  <w:p>
+    <w:pPr>
+      <w:spacing w:after="60"/>
+    </w:pPr>
+    <w:r>
+      <w:t xml:space="preserve"/>
+    </w:r>
+  </w:p>
+</w:hdr>
 </file>
 
 <file path=word/numbering.xml><?xml version="1.0" encoding="utf-8"?>

</xml_diff>